<commit_message>
Fix: formulaire EN envoie Oui/Non au Google Form + bouton Répondre + prix dans labels
</commit_message>
<xml_diff>
--- a/assets/🥂 Invitation.docx
+++ b/assets/🥂 Invitation.docx
@@ -7,7 +7,7 @@
         <w:pStyle w:val="NormalWeb"/>
         <w:ind w:firstLine="2552"/>
         <w:rPr>
-          <w:rFonts w:ascii="Apple Color Emoji" w:hAnsi="Apple Color Emoji" w:cs="Apple Color Emoji"/>
+          <w:rFonts w:ascii="Calibri" w:hAnsi="Calibri" w:cs="Calibri"/>
           <w:sz w:val="44"/>
           <w:szCs w:val="44"/>
         </w:rPr>
@@ -155,6 +155,7 @@
             </w:r>
             <w:r>
               <w:rPr>
+                <w:rFonts w:ascii="Calibri" w:hAnsi="Calibri" w:cs="Calibri"/>
                 <w:sz w:val="28"/>
                 <w:szCs w:val="28"/>
               </w:rPr>
@@ -162,6 +163,7 @@
             </w:r>
             <w:r>
               <w:rPr>
+                <w:rFonts w:ascii="Calibri" w:hAnsi="Calibri" w:cs="Calibri"/>
                 <w:sz w:val="28"/>
                 <w:szCs w:val="28"/>
               </w:rPr>
@@ -169,6 +171,7 @@
             </w:r>
             <w:r>
               <w:rPr>
+                <w:rFonts w:ascii="Calibri" w:hAnsi="Calibri" w:cs="Calibri"/>
                 <w:sz w:val="28"/>
                 <w:szCs w:val="28"/>
               </w:rPr>
@@ -176,6 +179,7 @@
             </w:r>
             <w:r>
               <w:rPr>
+                <w:rFonts w:ascii="Calibri" w:hAnsi="Calibri" w:cs="Calibri"/>
                 <w:sz w:val="28"/>
                 <w:szCs w:val="28"/>
               </w:rPr>
@@ -183,6 +187,7 @@
             </w:r>
             <w:r>
               <w:rPr>
+                <w:rFonts w:ascii="Calibri" w:hAnsi="Calibri" w:cs="Calibri"/>
                 <w:noProof/>
                 <w:sz w:val="28"/>
                 <w:szCs w:val="28"/>
@@ -256,6 +261,7 @@
             </w:r>
             <w:r>
               <w:rPr>
+                <w:rFonts w:ascii="Calibri" w:hAnsi="Calibri" w:cs="Calibri"/>
                 <w:sz w:val="28"/>
                 <w:szCs w:val="28"/>
               </w:rPr>
@@ -325,16 +331,16 @@
                 <w14:ligatures w14:val="standardContextual"/>
               </w:rPr>
               <w:drawing>
-                <wp:anchor distT="0" distB="0" distL="114300" distR="114300" simplePos="0" relativeHeight="251658240" behindDoc="0" locked="0" layoutInCell="1" allowOverlap="1" wp14:anchorId="7C527F17" wp14:editId="558FA236">
+                <wp:anchor distT="0" distB="0" distL="114300" distR="114300" simplePos="0" relativeHeight="251658240" behindDoc="0" locked="0" layoutInCell="1" allowOverlap="1" wp14:anchorId="7C527F17" wp14:editId="17E3BD4A">
                   <wp:simplePos x="0" y="0"/>
                   <wp:positionH relativeFrom="margin">
-                    <wp:posOffset>-6985</wp:posOffset>
+                    <wp:posOffset>-68580</wp:posOffset>
                   </wp:positionH>
                   <wp:positionV relativeFrom="margin">
-                    <wp:posOffset>67945</wp:posOffset>
+                    <wp:posOffset>255270</wp:posOffset>
                   </wp:positionV>
-                  <wp:extent cx="6271260" cy="3981450"/>
-                  <wp:effectExtent l="0" t="0" r="2540" b="6350"/>
+                  <wp:extent cx="6403340" cy="4065304"/>
+                  <wp:effectExtent l="0" t="0" r="0" b="0"/>
                   <wp:wrapSquare wrapText="bothSides"/>
                   <wp:docPr id="849772320" name="Picture 3" descr="A person and person holding a sign&#10;&#10;AI-generated content may be incorrect."/>
                   <wp:cNvGraphicFramePr>
@@ -362,7 +368,7 @@
                         <pic:spPr>
                           <a:xfrm>
                             <a:off x="0" y="0"/>
-                            <a:ext cx="6271260" cy="3981450"/>
+                            <a:ext cx="6403340" cy="4065304"/>
                           </a:xfrm>
                           <a:prstGeom prst="rect">
                             <a:avLst/>
@@ -395,18 +401,25 @@
             <w:pPr>
               <w:pStyle w:val="NormalWeb"/>
               <w:rPr>
+                <w:rFonts w:ascii="Calibri" w:hAnsi="Calibri" w:cs="Calibri"/>
+                <w:sz w:val="28"/>
+                <w:szCs w:val="28"/>
+              </w:rPr>
+            </w:pPr>
+            <w:r>
+              <w:rPr>
+                <w:rFonts w:ascii="Calibri" w:hAnsi="Calibri" w:cs="Calibri"/>
+                <w:sz w:val="28"/>
+                <w:szCs w:val="28"/>
+              </w:rPr>
+              <w:br/>
+            </w:r>
+            <w:r>
+              <w:rPr>
                 <w:rFonts w:ascii="Apple Color Emoji" w:hAnsi="Apple Color Emoji" w:cs="Apple Color Emoji"/>
                 <w:sz w:val="28"/>
                 <w:szCs w:val="28"/>
               </w:rPr>
-            </w:pPr>
-            <w:r>
-              <w:rPr>
-                <w:rFonts w:ascii="Apple Color Emoji" w:hAnsi="Apple Color Emoji" w:cs="Apple Color Emoji"/>
-                <w:sz w:val="28"/>
-                <w:szCs w:val="28"/>
-              </w:rPr>
-              <w:br/>
               <w:t>📍</w:t>
             </w:r>
             <w:r>
@@ -467,7 +480,31 @@
                 <w:sz w:val="28"/>
                 <w:szCs w:val="28"/>
               </w:rPr>
-              <w:t xml:space="preserve"> Dans le </w:t>
+              <w:t xml:space="preserve"> </w:t>
+            </w:r>
+            <w:r>
+              <w:rPr>
+                <w:rFonts w:ascii="Calibri" w:hAnsi="Calibri" w:cs="Calibri"/>
+                <w:sz w:val="28"/>
+                <w:szCs w:val="28"/>
+              </w:rPr>
+              <w:t>Village Vigneron,</w:t>
+            </w:r>
+            <w:r>
+              <w:rPr>
+                <w:rFonts w:ascii="Calibri" w:hAnsi="Calibri" w:cs="Calibri"/>
+                <w:sz w:val="28"/>
+                <w:szCs w:val="28"/>
+              </w:rPr>
+              <w:br/>
+            </w:r>
+            <w:r>
+              <w:rPr>
+                <w:rFonts w:ascii="Calibri" w:hAnsi="Calibri" w:cs="Calibri"/>
+                <w:sz w:val="28"/>
+                <w:szCs w:val="28"/>
+              </w:rPr>
+              <w:t xml:space="preserve">4 La </w:t>
             </w:r>
             <w:proofErr w:type="spellStart"/>
             <w:r>
@@ -476,7 +513,7 @@
                 <w:sz w:val="28"/>
                 <w:szCs w:val="28"/>
               </w:rPr>
-              <w:t>Vignoble</w:t>
+              <w:t>Plessisière</w:t>
             </w:r>
             <w:proofErr w:type="spellEnd"/>
             <w:r>
@@ -485,7 +522,7 @@
                 <w:sz w:val="28"/>
                 <w:szCs w:val="28"/>
               </w:rPr>
-              <w:t xml:space="preserve"> Nantais.</w:t>
+              <w:t>,</w:t>
             </w:r>
             <w:r>
               <w:rPr>
@@ -501,8 +538,18 @@
                 <w:sz w:val="28"/>
                 <w:szCs w:val="28"/>
               </w:rPr>
-              <w:t>(</w:t>
-            </w:r>
+              <w:t>44330 La Chapelle-</w:t>
+            </w:r>
+            <w:proofErr w:type="spellStart"/>
+            <w:r>
+              <w:rPr>
+                <w:rFonts w:ascii="Calibri" w:hAnsi="Calibri" w:cs="Calibri"/>
+                <w:sz w:val="28"/>
+                <w:szCs w:val="28"/>
+              </w:rPr>
+              <w:t>Heulin</w:t>
+            </w:r>
+            <w:proofErr w:type="spellEnd"/>
             <w:r>
               <w:rPr>
                 <w:rFonts w:ascii="Calibri" w:hAnsi="Calibri" w:cs="Calibri"/>
@@ -511,68 +558,14 @@
                 <w:sz w:val="28"/>
                 <w:szCs w:val="28"/>
               </w:rPr>
-              <w:t xml:space="preserve">Plus </w:t>
-            </w:r>
-            <w:proofErr w:type="spellStart"/>
-            <w:r>
-              <w:rPr>
-                <w:rFonts w:ascii="Calibri" w:hAnsi="Calibri" w:cs="Calibri"/>
-                <w:i/>
-                <w:iCs/>
-                <w:sz w:val="28"/>
-                <w:szCs w:val="28"/>
-              </w:rPr>
-              <w:t>d’infos</w:t>
-            </w:r>
-            <w:proofErr w:type="spellEnd"/>
-            <w:r>
-              <w:rPr>
-                <w:rFonts w:ascii="Calibri" w:hAnsi="Calibri" w:cs="Calibri"/>
-                <w:i/>
-                <w:iCs/>
-                <w:sz w:val="28"/>
-                <w:szCs w:val="28"/>
-              </w:rPr>
-              <w:t xml:space="preserve"> a </w:t>
-            </w:r>
-            <w:proofErr w:type="spellStart"/>
-            <w:r>
-              <w:rPr>
-                <w:rFonts w:ascii="Calibri" w:hAnsi="Calibri" w:cs="Calibri"/>
-                <w:i/>
-                <w:iCs/>
-                <w:sz w:val="28"/>
-                <w:szCs w:val="28"/>
-              </w:rPr>
-              <w:t>venir</w:t>
-            </w:r>
-            <w:proofErr w:type="spellEnd"/>
-            <w:r>
-              <w:rPr>
-                <w:rFonts w:ascii="Calibri" w:hAnsi="Calibri" w:cs="Calibri"/>
-                <w:i/>
-                <w:iCs/>
-                <w:sz w:val="28"/>
-                <w:szCs w:val="28"/>
-              </w:rPr>
-              <w:t>)</w:t>
-            </w:r>
-            <w:r>
-              <w:rPr>
-                <w:rFonts w:ascii="Calibri" w:hAnsi="Calibri" w:cs="Calibri"/>
-                <w:i/>
-                <w:iCs/>
-                <w:sz w:val="28"/>
-                <w:szCs w:val="28"/>
-              </w:rPr>
-              <w:br/>
+              <w:t xml:space="preserve"> </w:t>
             </w:r>
           </w:p>
           <w:p>
             <w:pPr>
               <w:pStyle w:val="NormalWeb"/>
               <w:rPr>
-                <w:rFonts w:ascii="Apple Color Emoji" w:hAnsi="Apple Color Emoji" w:cs="Apple Color Emoji"/>
+                <w:rFonts w:ascii="Calibri" w:hAnsi="Calibri" w:cs="Calibri"/>
                 <w:sz w:val="28"/>
                 <w:szCs w:val="28"/>
               </w:rPr>
@@ -606,28 +599,27 @@
           <w:p>
             <w:pPr>
               <w:pStyle w:val="NormalWeb"/>
+              <w:ind w:right="312"/>
               <w:jc w:val="center"/>
               <w:rPr>
                 <w:rFonts w:ascii="Calibri" w:hAnsi="Calibri" w:cs="Calibri"/>
-                <w:b/>
-                <w:bCs/>
                 <w:sz w:val="28"/>
                 <w:szCs w:val="28"/>
               </w:rPr>
             </w:pPr>
             <w:r>
               <w:rPr>
-                <w:rFonts w:ascii="Apple Color Emoji" w:hAnsi="Apple Color Emoji" w:cs="Apple Color Emoji"/>
+                <w:rFonts w:ascii="Calibri" w:hAnsi="Calibri" w:cs="Calibri"/>
                 <w:noProof/>
                 <w:sz w:val="28"/>
                 <w:szCs w:val="28"/>
                 <w14:ligatures w14:val="standardContextual"/>
               </w:rPr>
               <w:drawing>
-                <wp:inline distT="0" distB="0" distL="0" distR="0" wp14:anchorId="02057AAB" wp14:editId="14AF23C8">
-                  <wp:extent cx="1409700" cy="1409700"/>
-                  <wp:effectExtent l="0" t="0" r="0" b="0"/>
-                  <wp:docPr id="647851677" name="Picture 4" descr="A qr code on a white background&#10;&#10;AI-generated content may be incorrect."/>
+                <wp:inline distT="0" distB="0" distL="0" distR="0" wp14:anchorId="4CC11B0E" wp14:editId="5445C33D">
+                  <wp:extent cx="1238250" cy="1238250"/>
+                  <wp:effectExtent l="0" t="0" r="6350" b="6350"/>
+                  <wp:docPr id="2009288718" name="Graphic 2"/>
                   <wp:cNvGraphicFramePr>
                     <a:graphicFrameLocks xmlns:a="http://schemas.openxmlformats.org/drawingml/2006/main" noChangeAspect="1"/>
                   </wp:cNvGraphicFramePr>
@@ -635,14 +627,14 @@
                     <a:graphicData uri="http://schemas.openxmlformats.org/drawingml/2006/picture">
                       <pic:pic xmlns:pic="http://schemas.openxmlformats.org/drawingml/2006/picture">
                         <pic:nvPicPr>
-                          <pic:cNvPr id="647851677" name="Picture 4" descr="A qr code on a white background&#10;&#10;AI-generated content may be incorrect."/>
+                          <pic:cNvPr id="2009288718" name="Graphic 2009288718"/>
                           <pic:cNvPicPr/>
                         </pic:nvPicPr>
                         <pic:blipFill>
-                          <a:blip r:embed="rId5" cstate="print">
+                          <a:blip r:embed="rId5">
                             <a:extLst>
-                              <a:ext uri="{28A0092B-C50C-407E-A947-70E740481C1C}">
-                                <a14:useLocalDpi xmlns:a14="http://schemas.microsoft.com/office/drawing/2010/main" val="0"/>
+                              <a:ext uri="{96DAC541-7B7A-43D3-8B79-37D633B846F1}">
+                                <asvg:svgBlip xmlns:asvg="http://schemas.microsoft.com/office/drawing/2016/SVG/main" r:embed="rId6"/>
                               </a:ext>
                             </a:extLst>
                           </a:blip>
@@ -653,7 +645,7 @@
                         <pic:spPr>
                           <a:xfrm>
                             <a:off x="0" y="0"/>
-                            <a:ext cx="1409700" cy="1409700"/>
+                            <a:ext cx="1238250" cy="1238250"/>
                           </a:xfrm>
                           <a:prstGeom prst="rect">
                             <a:avLst/>
@@ -665,31 +657,12 @@
                 </wp:inline>
               </w:drawing>
             </w:r>
-            <w:r>
-              <w:rPr>
-                <w:rFonts w:ascii="Apple Color Emoji" w:hAnsi="Apple Color Emoji" w:cs="Apple Color Emoji"/>
-                <w:sz w:val="28"/>
-                <w:szCs w:val="28"/>
-              </w:rPr>
-              <w:br/>
-              <w:t>👆</w:t>
-            </w:r>
-            <w:r>
-              <w:rPr>
-                <w:sz w:val="28"/>
-                <w:szCs w:val="28"/>
-              </w:rPr>
-              <w:br/>
-            </w:r>
-            <w:r>
-              <w:rPr>
-                <w:rFonts w:ascii="Apple Color Emoji" w:hAnsi="Apple Color Emoji" w:cs="Apple Color Emoji"/>
-                <w:sz w:val="28"/>
-                <w:szCs w:val="28"/>
-              </w:rPr>
-              <w:t>📅</w:t>
-            </w:r>
-            <w:r>
+          </w:p>
+          <w:p>
+            <w:pPr>
+              <w:pStyle w:val="NormalWeb"/>
+              <w:ind w:right="312"/>
+              <w:jc w:val="center"/>
               <w:rPr>
                 <w:rFonts w:ascii="Calibri" w:hAnsi="Calibri" w:cs="Calibri"/>
                 <w:b/>
@@ -697,9 +670,58 @@
                 <w:sz w:val="28"/>
                 <w:szCs w:val="28"/>
               </w:rPr>
-              <w:t xml:space="preserve">  A noter dans </w:t>
-            </w:r>
-            <w:proofErr w:type="spellStart"/>
+            </w:pPr>
+            <w:hyperlink r:id="rId7" w:history="1">
+              <w:r>
+                <w:rPr>
+                  <w:rStyle w:val="Hyperlink"/>
+                  <w:rFonts w:ascii="Calibri" w:hAnsi="Calibri" w:cs="Calibri"/>
+                  <w:sz w:val="18"/>
+                  <w:szCs w:val="18"/>
+                </w:rPr>
+                <w:t>https://sebmarchand44.github.io/20ansmariage/</w:t>
+              </w:r>
+            </w:hyperlink>
+            <w:r>
+              <w:rPr>
+                <w:rFonts w:ascii="Calibri" w:hAnsi="Calibri" w:cs="Calibri"/>
+                <w:sz w:val="18"/>
+                <w:szCs w:val="18"/>
+              </w:rPr>
+              <w:br/>
+            </w:r>
+            <w:r>
+              <w:rPr>
+                <w:rFonts w:ascii="Calibri" w:hAnsi="Calibri" w:cs="Calibri"/>
+                <w:sz w:val="28"/>
+                <w:szCs w:val="28"/>
+              </w:rPr>
+              <w:br/>
+            </w:r>
+            <w:r>
+              <w:rPr>
+                <w:rFonts w:ascii="Apple Color Emoji" w:hAnsi="Apple Color Emoji" w:cs="Apple Color Emoji"/>
+                <w:sz w:val="28"/>
+                <w:szCs w:val="28"/>
+              </w:rPr>
+              <w:t>👆</w:t>
+            </w:r>
+            <w:r>
+              <w:rPr>
+                <w:rFonts w:ascii="Calibri" w:hAnsi="Calibri" w:cs="Calibri"/>
+                <w:sz w:val="28"/>
+                <w:szCs w:val="28"/>
+              </w:rPr>
+              <w:br/>
+            </w:r>
+            <w:r>
+              <w:rPr>
+                <w:rFonts w:ascii="Apple Color Emoji" w:hAnsi="Apple Color Emoji" w:cs="Apple Color Emoji"/>
+                <w:sz w:val="28"/>
+                <w:szCs w:val="28"/>
+              </w:rPr>
+              <w:t>📅</w:t>
+            </w:r>
             <w:r>
               <w:rPr>
                 <w:rFonts w:ascii="Calibri" w:hAnsi="Calibri" w:cs="Calibri"/>
@@ -708,9 +730,9 @@
                 <w:sz w:val="28"/>
                 <w:szCs w:val="28"/>
               </w:rPr>
-              <w:t>votre</w:t>
-            </w:r>
-            <w:proofErr w:type="spellEnd"/>
+              <w:t xml:space="preserve">  </w:t>
+            </w:r>
+            <w:proofErr w:type="spellStart"/>
             <w:r>
               <w:rPr>
                 <w:rFonts w:ascii="Calibri" w:hAnsi="Calibri" w:cs="Calibri"/>
@@ -719,9 +741,9 @@
                 <w:sz w:val="28"/>
                 <w:szCs w:val="28"/>
               </w:rPr>
-              <w:t xml:space="preserve"> </w:t>
-            </w:r>
-            <w:proofErr w:type="spellStart"/>
+              <w:t>Scannez</w:t>
+            </w:r>
+            <w:proofErr w:type="spellEnd"/>
             <w:r>
               <w:rPr>
                 <w:rFonts w:ascii="Calibri" w:hAnsi="Calibri" w:cs="Calibri"/>
@@ -730,7 +752,50 @@
                 <w:sz w:val="28"/>
                 <w:szCs w:val="28"/>
               </w:rPr>
-              <w:t>calendrier</w:t>
+              <w:t xml:space="preserve"> </w:t>
+            </w:r>
+            <w:proofErr w:type="spellStart"/>
+            <w:r>
+              <w:rPr>
+                <w:rFonts w:ascii="Calibri" w:hAnsi="Calibri" w:cs="Calibri"/>
+                <w:b/>
+                <w:bCs/>
+                <w:sz w:val="28"/>
+                <w:szCs w:val="28"/>
+              </w:rPr>
+              <w:t>ou</w:t>
+            </w:r>
+            <w:proofErr w:type="spellEnd"/>
+            <w:r>
+              <w:rPr>
+                <w:rFonts w:ascii="Calibri" w:hAnsi="Calibri" w:cs="Calibri"/>
+                <w:b/>
+                <w:bCs/>
+                <w:sz w:val="28"/>
+                <w:szCs w:val="28"/>
+              </w:rPr>
+              <w:t xml:space="preserve"> </w:t>
+            </w:r>
+            <w:proofErr w:type="spellStart"/>
+            <w:r>
+              <w:rPr>
+                <w:rFonts w:ascii="Calibri" w:hAnsi="Calibri" w:cs="Calibri"/>
+                <w:b/>
+                <w:bCs/>
+                <w:sz w:val="28"/>
+                <w:szCs w:val="28"/>
+              </w:rPr>
+              <w:t>c</w:t>
+            </w:r>
+            <w:r>
+              <w:rPr>
+                <w:rFonts w:ascii="Calibri" w:hAnsi="Calibri" w:cs="Calibri"/>
+                <w:b/>
+                <w:bCs/>
+                <w:sz w:val="28"/>
+                <w:szCs w:val="28"/>
+              </w:rPr>
+              <w:t>liquez</w:t>
             </w:r>
             <w:proofErr w:type="spellEnd"/>
           </w:p>
@@ -754,13 +819,11 @@
     </w:tbl>
     <w:p>
       <w:pPr>
-        <w:pStyle w:val="NormalWeb"/>
         <w:rPr>
           <w:rFonts w:ascii="Calibri" w:hAnsi="Calibri" w:cs="Calibri"/>
         </w:rPr>
       </w:pPr>
     </w:p>
-    <w:p/>
     <w:sectPr>
       <w:pgSz w:w="16820" w:h="11900" w:orient="landscape"/>
       <w:pgMar w:top="1440" w:right="1440" w:bottom="1440" w:left="1440" w:header="708" w:footer="708" w:gutter="0"/>
@@ -1371,7 +1434,6 @@
   <w:style w:type="character" w:default="1" w:styleId="DefaultParagraphFont">
     <w:name w:val="Default Paragraph Font"/>
     <w:uiPriority w:val="1"/>
-    <w:semiHidden/>
     <w:unhideWhenUsed/>
   </w:style>
   <w:style w:type="table" w:default="1" w:styleId="TableNormal">
@@ -1729,6 +1791,29 @@
         <w:insideV w:val="single" w:sz="4" w:space="0" w:color="auto"/>
       </w:tblBorders>
     </w:tblPr>
+  </w:style>
+  <w:style w:type="character" w:styleId="Hyperlink">
+    <w:name w:val="Hyperlink"/>
+    <w:basedOn w:val="DefaultParagraphFont"/>
+    <w:uiPriority w:val="99"/>
+    <w:unhideWhenUsed/>
+    <w:rsid w:val="00AA24DF"/>
+    <w:rPr>
+      <w:color w:val="467886" w:themeColor="hyperlink"/>
+      <w:u w:val="single"/>
+    </w:rPr>
+  </w:style>
+  <w:style w:type="character" w:styleId="UnresolvedMention">
+    <w:name w:val="Unresolved Mention"/>
+    <w:basedOn w:val="DefaultParagraphFont"/>
+    <w:uiPriority w:val="99"/>
+    <w:semiHidden/>
+    <w:unhideWhenUsed/>
+    <w:rsid w:val="00AA24DF"/>
+    <w:rPr>
+      <w:color w:val="605E5C"/>
+      <w:shd w:val="clear" w:color="auto" w:fill="E1DFDD"/>
+    </w:rPr>
   </w:style>
 </w:styles>
 </file>

</xml_diff>

<commit_message>
Ajout prénom dans le label: 'Nom et Prénom (ou Famille)'
</commit_message>
<xml_diff>
--- a/assets/🥂 Invitation.docx
+++ b/assets/🥂 Invitation.docx
@@ -118,6 +118,11 @@
         <w:tc>
           <w:tcPr>
             <w:tcW w:w="4248" w:type="dxa"/>
+            <w:tcBorders>
+              <w:top w:val="single" w:sz="4" w:space="0" w:color="auto"/>
+              <w:left w:val="single" w:sz="4" w:space="0" w:color="auto"/>
+              <w:right w:val="single" w:sz="4" w:space="0" w:color="auto"/>
+            </w:tcBorders>
           </w:tcPr>
           <w:p>
             <w:pPr>
@@ -315,6 +320,9 @@
           <w:tcPr>
             <w:tcW w:w="10064" w:type="dxa"/>
             <w:vMerge w:val="restart"/>
+            <w:tcBorders>
+              <w:left w:val="single" w:sz="4" w:space="0" w:color="auto"/>
+            </w:tcBorders>
           </w:tcPr>
           <w:p>
             <w:pPr>
@@ -331,15 +339,15 @@
                 <w14:ligatures w14:val="standardContextual"/>
               </w:rPr>
               <w:drawing>
-                <wp:anchor distT="0" distB="0" distL="114300" distR="114300" simplePos="0" relativeHeight="251658240" behindDoc="0" locked="0" layoutInCell="1" allowOverlap="1" wp14:anchorId="7C527F17" wp14:editId="17E3BD4A">
+                <wp:anchor distT="0" distB="0" distL="114300" distR="114300" simplePos="0" relativeHeight="251658240" behindDoc="0" locked="0" layoutInCell="1" allowOverlap="1" wp14:anchorId="7C527F17" wp14:editId="7FE5FA17">
                   <wp:simplePos x="0" y="0"/>
                   <wp:positionH relativeFrom="margin">
-                    <wp:posOffset>-68580</wp:posOffset>
+                    <wp:posOffset>-65405</wp:posOffset>
                   </wp:positionH>
                   <wp:positionV relativeFrom="margin">
-                    <wp:posOffset>255270</wp:posOffset>
+                    <wp:posOffset>314325</wp:posOffset>
                   </wp:positionV>
-                  <wp:extent cx="6403340" cy="4065304"/>
+                  <wp:extent cx="6948845" cy="4411345"/>
                   <wp:effectExtent l="0" t="0" r="0" b="0"/>
                   <wp:wrapSquare wrapText="bothSides"/>
                   <wp:docPr id="849772320" name="Picture 3" descr="A person and person holding a sign&#10;&#10;AI-generated content may be incorrect."/>
@@ -368,7 +376,7 @@
                         <pic:spPr>
                           <a:xfrm>
                             <a:off x="0" y="0"/>
-                            <a:ext cx="6403340" cy="4065304"/>
+                            <a:ext cx="6948845" cy="4411345"/>
                           </a:xfrm>
                           <a:prstGeom prst="rect">
                             <a:avLst/>
@@ -396,6 +404,10 @@
         <w:tc>
           <w:tcPr>
             <w:tcW w:w="4248" w:type="dxa"/>
+            <w:tcBorders>
+              <w:left w:val="single" w:sz="4" w:space="0" w:color="auto"/>
+              <w:right w:val="single" w:sz="4" w:space="0" w:color="auto"/>
+            </w:tcBorders>
           </w:tcPr>
           <w:p>
             <w:pPr>
@@ -576,6 +588,9 @@
           <w:tcPr>
             <w:tcW w:w="10064" w:type="dxa"/>
             <w:vMerge/>
+            <w:tcBorders>
+              <w:left w:val="single" w:sz="4" w:space="0" w:color="auto"/>
+            </w:tcBorders>
           </w:tcPr>
           <w:p>
             <w:pPr>
@@ -595,6 +610,11 @@
         <w:tc>
           <w:tcPr>
             <w:tcW w:w="4248" w:type="dxa"/>
+            <w:tcBorders>
+              <w:left w:val="single" w:sz="4" w:space="0" w:color="auto"/>
+              <w:bottom w:val="single" w:sz="4" w:space="0" w:color="auto"/>
+              <w:right w:val="single" w:sz="4" w:space="0" w:color="auto"/>
+            </w:tcBorders>
           </w:tcPr>
           <w:p>
             <w:pPr>
@@ -804,6 +824,9 @@
           <w:tcPr>
             <w:tcW w:w="10064" w:type="dxa"/>
             <w:vMerge/>
+            <w:tcBorders>
+              <w:left w:val="single" w:sz="4" w:space="0" w:color="auto"/>
+            </w:tcBorders>
           </w:tcPr>
           <w:p>
             <w:pPr>

</xml_diff>